<commit_message>
Align CV footer title and education formatting
</commit_message>
<xml_diff>
--- a/cv/Vikash_Vashisth_CFD_Thermal_Fluid_Engineer_CV.docx
+++ b/cv/Vikash_Vashisth_CFD_Thermal_Fluid_Engineer_CV.docx
@@ -426,6 +426,7 @@
         <w:pBdr>
           <w:bottom w:val="single" w:sz="5" w:space="3" w:color="D2DAE1"/>
         </w:pBdr>
+        <w:spacing w:before="180"/>
       </w:pPr>
       <w:r>
         <w:lastRenderedPageBreak/>
@@ -617,7 +618,7 @@
         <w:t xml:space="preserve">Compared conventional and </w:t>
       </w:r>
       <w:r>
-        <w:t>novel developed</w:t>
+        <w:t>newly developed</w:t>
       </w:r>
       <w:r>
         <w:t xml:space="preserve"> configurations, with predicted power numbers agreeing within approximately 10% of benchmark measurements</w:t>
@@ -632,6 +633,7 @@
         <w:pBdr>
           <w:bottom w:val="single" w:sz="5" w:space="3" w:color="D2DAE1"/>
         </w:pBdr>
+        <w:spacing w:before="180"/>
       </w:pPr>
       <w:r>
         <w:t>SELECTED ENGINEERING PROJECT</w:t>
@@ -716,6 +718,7 @@
         <w:pBdr>
           <w:bottom w:val="single" w:sz="5" w:space="3" w:color="D2DAE1"/>
         </w:pBdr>
+        <w:spacing w:before="180"/>
       </w:pPr>
       <w:r>
         <w:t>EDUCATION</w:t>
@@ -723,26 +726,36 @@
     </w:p>
     <w:p>
       <w:pPr>
-        <w:pStyle w:val="CVEducation"/>
+        <w:pStyle w:val="CVOrg"/>
+        <w:tabs>
+          <w:tab w:val="right" w:pos="9865"/>
+        </w:tabs>
       </w:pPr>
       <w:r>
-        <w:t xml:space="preserve">PhD, Chemical </w:t>
-      </w:r>
-      <w:proofErr w:type="gramStart"/>
-      <w:r>
-        <w:t>Engineering  |</w:t>
-      </w:r>
-      <w:proofErr w:type="gramEnd"/>
-      <w:r>
-        <w:t xml:space="preserve">  Indian Institute of Technology </w:t>
-      </w:r>
-      <w:proofErr w:type="gramStart"/>
-      <w:r>
-        <w:t>Roorkee  |</w:t>
-      </w:r>
-      <w:proofErr w:type="gramEnd"/>
-      <w:r>
-        <w:t xml:space="preserve">  2015 - 2021</w:t>
+        <w:t>Indian Institute of Technology Roorkee</w:t>
+      </w:r>
+      <w:r>
+        <w:rPr>
+          <w:b w:val="0"/>
+          <w:sz w:val="17"/>
+        </w:rPr>
+        <w:tab/>
+        <w:t>Roorkee, India</w:t>
+      </w:r>
+    </w:p>
+    <w:p>
+      <w:pPr>
+        <w:pStyle w:val="CVPosition"/>
+        <w:tabs>
+          <w:tab w:val="right" w:pos="9865"/>
+        </w:tabs>
+      </w:pPr>
+      <w:r>
+        <w:t>PhD, Chemical Engineering</w:t>
+      </w:r>
+      <w:r>
+        <w:tab/>
+        <w:t>2015 - 2021</w:t>
       </w:r>
     </w:p>
     <w:p>
@@ -755,31 +768,17 @@
     </w:p>
     <w:p>
       <w:pPr>
-        <w:pStyle w:val="CVEducation"/>
+        <w:pStyle w:val="CVPosition"/>
+        <w:tabs>
+          <w:tab w:val="right" w:pos="9865"/>
+        </w:tabs>
       </w:pPr>
-      <w:proofErr w:type="spellStart"/>
-      <w:r>
-        <w:t>M.Tech</w:t>
-      </w:r>
-      <w:proofErr w:type="spellEnd"/>
-      <w:r>
-        <w:t xml:space="preserve">, Chemical </w:t>
-      </w:r>
-      <w:proofErr w:type="gramStart"/>
-      <w:r>
-        <w:t>Engineering  |</w:t>
-      </w:r>
-      <w:proofErr w:type="gramEnd"/>
-      <w:r>
-        <w:t xml:space="preserve">  Indian Institute of Technology </w:t>
-      </w:r>
-      <w:proofErr w:type="gramStart"/>
-      <w:r>
-        <w:t>Roorkee  |</w:t>
-      </w:r>
-      <w:proofErr w:type="gramEnd"/>
-      <w:r>
-        <w:t xml:space="preserve">  2011 - 2013</w:t>
+      <w:r>
+        <w:t>M.Tech, Chemical Engineering</w:t>
+      </w:r>
+      <w:r>
+        <w:tab/>
+        <w:t>2011 - 2013</w:t>
       </w:r>
     </w:p>
     <w:p>
@@ -788,6 +787,7 @@
         <w:pBdr>
           <w:bottom w:val="single" w:sz="5" w:space="3" w:color="D2DAE1"/>
         </w:pBdr>
+        <w:spacing w:before="180"/>
       </w:pPr>
       <w:r>
         <w:t>SELECTED PUBLICATIONS</w:t>
@@ -829,6 +829,7 @@
         <w:pBdr>
           <w:bottom w:val="single" w:sz="5" w:space="3" w:color="D2DAE1"/>
         </w:pBdr>
+        <w:spacing w:before="180"/>
       </w:pPr>
       <w:r>
         <w:t>TRAINING &amp; ADDITIONAL INFORMATION</w:t>
@@ -932,7 +933,7 @@
     </w:r>
     <w:proofErr w:type="gramEnd"/>
     <w:r>
-      <w:t xml:space="preserve">  CFD &amp; Thermal-Fluid Engineer</w:t>
+      <w:t xml:space="preserve">  CFD Engineer</w:t>
     </w:r>
     <w:r>
       <w:tab/>

</xml_diff>

<commit_message>
Publish reviewed portfolio and CV updates
Co-authored-by: Copilot <223556219+Copilot@users.noreply.github.com>
</commit_message>
<xml_diff>
--- a/cv/Vikash_Vashisth_CFD_Thermal_Fluid_Engineer_CV.docx
+++ b/cv/Vikash_Vashisth_CFD_Thermal_Fluid_Engineer_CV.docx
@@ -87,23 +87,7 @@
         <w:pStyle w:val="CVBody"/>
       </w:pPr>
       <w:r>
-        <w:t xml:space="preserve">CFD engineer with a PhD in Chemical Engineering and experience in academic and industry-linked R&amp;D, </w:t>
-      </w:r>
-      <w:proofErr w:type="spellStart"/>
-      <w:r>
-        <w:t>specialising</w:t>
-      </w:r>
-      <w:proofErr w:type="spellEnd"/>
-      <w:r>
-        <w:t xml:space="preserve"> in </w:t>
-      </w:r>
-      <w:proofErr w:type="gramStart"/>
-      <w:r>
-        <w:t>thermal-fluid</w:t>
-      </w:r>
-      <w:proofErr w:type="gramEnd"/>
-      <w:r>
-        <w:t xml:space="preserve"> analysis, reacting and multiphase flows, turbulence modelling and heat transfer. Combines numerical verification, mesh-independence assessment and experimental validation to evaluate equipment performance and inform design and operating decisions. Advanced ANSYS Fluent expertise, complemented by STAR-CCM+, electromagnetic-CFD analysis and Python-based simulation automation</w:t>
+        <w:t>CFD engineer with a PhD in Chemical Engineering and experience in academic and industry-linked R&amp;D, specialising in thermal-fluid analysis, reacting and multiphase flows, turbulence modelling and heat transfer. Combines numerical verification, mesh-independence assessment and experimental validation to evaluate equipment performance and inform design and operating decisions. Advanced ANSYS Fluent expertise, complemented by STAR-CCM+, electromagnetic-CFD analysis and Python-based simulation automation</w:t>
       </w:r>
       <w:r>
         <w:t>.</w:t>
@@ -204,31 +188,10 @@
         <w:t xml:space="preserve">Software: </w:t>
       </w:r>
       <w:r>
-        <w:t xml:space="preserve">ANSYS Fluent (advanced); STAR-CCM+; ANSYS HFSS; Python, </w:t>
+        <w:t>ANSYS Fluent</w:t>
       </w:r>
-      <w:proofErr w:type="spellStart"/>
       <w:r>
-        <w:t>PyFluent</w:t>
-      </w:r>
-      <w:proofErr w:type="spellEnd"/>
-      <w:r>
-        <w:t xml:space="preserve"> and </w:t>
-      </w:r>
-      <w:proofErr w:type="spellStart"/>
-      <w:r>
-        <w:t>PyAEDT</w:t>
-      </w:r>
-      <w:proofErr w:type="spellEnd"/>
-      <w:r>
-        <w:t xml:space="preserve">; MATLAB; UDF/C; Siemens NX; Workbench, Meshing, </w:t>
-      </w:r>
-      <w:proofErr w:type="spellStart"/>
-      <w:r>
-        <w:t>DesignModeler</w:t>
-      </w:r>
-      <w:proofErr w:type="spellEnd"/>
-      <w:r>
-        <w:t>; Linux.</w:t>
+        <w:t>; STAR-CCM+; ANSYS HFSS; Python, PyFluent and PyAEDT; MATLAB; UDF/C; Siemens NX; Workbench, Meshing, DesignModeler; Linux.</w:t>
       </w:r>
     </w:p>
     <w:p>
@@ -331,23 +294,7 @@
         <w:ind w:left="210" w:hanging="130"/>
       </w:pPr>
       <w:r>
-        <w:t xml:space="preserve">•  Developed fully automated two-way HFSS-Fluent coupling using </w:t>
-      </w:r>
-      <w:proofErr w:type="spellStart"/>
-      <w:r>
-        <w:t>PyAEDT</w:t>
-      </w:r>
-      <w:proofErr w:type="spellEnd"/>
-      <w:r>
-        <w:t xml:space="preserve"> and </w:t>
-      </w:r>
-      <w:proofErr w:type="spellStart"/>
-      <w:r>
-        <w:t>PyFluent</w:t>
-      </w:r>
-      <w:proofErr w:type="spellEnd"/>
-      <w:r>
-        <w:t>, integrating electromagnetic power deposition with fluid flow, heat transfer and finite-rate chemistry.</w:t>
+        <w:t>•  Developed fully automated two-way HFSS-Fluent coupling using PyAEDT and PyFluent, integrating electromagnetic power deposition with fluid flow, heat transfer and finite-rate chemistry.</w:t>
       </w:r>
       <w:r>
         <w:t xml:space="preserve"> </w:t>
@@ -401,15 +348,7 @@
         <w:t xml:space="preserve">•  </w:t>
       </w:r>
       <w:r>
-        <w:t xml:space="preserve">Led biweekly CFD reviews with </w:t>
-      </w:r>
-      <w:proofErr w:type="spellStart"/>
-      <w:r>
-        <w:t>NitroCapt</w:t>
-      </w:r>
-      <w:proofErr w:type="spellEnd"/>
-      <w:r>
-        <w:t xml:space="preserve"> AB and research partners, presenting simulation results and engineering recommendations</w:t>
+        <w:t>Led biweekly CFD reviews with NitroCapt AB and research partners, presenting simulation results and engineering recommendations</w:t>
       </w:r>
       <w:r>
         <w:t>.</w:t>
@@ -491,15 +430,7 @@
         <w:t xml:space="preserve">•  </w:t>
       </w:r>
       <w:r>
-        <w:t xml:space="preserve">Established mesh-independent predictions and validated liquid-spreading </w:t>
-      </w:r>
-      <w:proofErr w:type="spellStart"/>
-      <w:r>
-        <w:t>behaviour</w:t>
-      </w:r>
-      <w:proofErr w:type="spellEnd"/>
-      <w:r>
-        <w:t xml:space="preserve"> against experimental measurements</w:t>
+        <w:t>Established mesh-independent predictions and validated liquid-spreading behaviour against experimental measurements</w:t>
       </w:r>
       <w:r>
         <w:t>.</w:t>
@@ -528,17 +459,8 @@
           <w:sz w:val="17"/>
         </w:rPr>
         <w:tab/>
-      </w:r>
-      <w:proofErr w:type="spellStart"/>
-      <w:r>
-        <w:rPr>
-          <w:b w:val="0"/>
-          <w:color w:val="42525E"/>
-          <w:sz w:val="17"/>
-        </w:rPr>
         <w:t>Roorkee</w:t>
       </w:r>
-      <w:proofErr w:type="spellEnd"/>
       <w:r>
         <w:rPr>
           <w:b w:val="0"/>
@@ -578,13 +500,8 @@
       <w:r>
         <w:t xml:space="preserve">•  </w:t>
       </w:r>
-      <w:proofErr w:type="spellStart"/>
       <w:r>
-        <w:t>Analysed</w:t>
-      </w:r>
-      <w:proofErr w:type="spellEnd"/>
-      <w:r>
-        <w:t xml:space="preserve"> rotor-stator mixer performance using sliding-mesh RANS and LES, evaluating </w:t>
+        <w:t xml:space="preserve">Analysed rotor-stator mixer performance using sliding-mesh RANS and LES, evaluating </w:t>
       </w:r>
       <w:r>
         <w:t>mesh-</w:t>
@@ -846,15 +763,7 @@
         <w:t xml:space="preserve">Training: </w:t>
       </w:r>
       <w:r>
-        <w:t xml:space="preserve">Ansys Learning Hub - </w:t>
-      </w:r>
-      <w:proofErr w:type="spellStart"/>
-      <w:r>
-        <w:t>PyFluent</w:t>
-      </w:r>
-      <w:proofErr w:type="spellEnd"/>
-      <w:r>
-        <w:t xml:space="preserve"> and HFSS (2026).</w:t>
+        <w:t>Ansys Learning Hub - PyFluent and HFSS (2026).</w:t>
       </w:r>
     </w:p>
     <w:p>
@@ -868,15 +777,7 @@
         <w:t xml:space="preserve">Languages and mobility: </w:t>
       </w:r>
       <w:r>
-        <w:t xml:space="preserve">English - fluent; Swedish - A2 certificate, continuing studies; Swedish driving </w:t>
-      </w:r>
-      <w:proofErr w:type="spellStart"/>
-      <w:r>
-        <w:t>licence</w:t>
-      </w:r>
-      <w:proofErr w:type="spellEnd"/>
-      <w:r>
-        <w:t xml:space="preserve"> (B); open to relocation.</w:t>
+        <w:t>English - fluent; Swedish - A2 certificate, continuing studies; Swedish driving licence (B); open to relocation.</w:t>
       </w:r>
     </w:p>
     <w:sectPr>
@@ -925,15 +826,7 @@
       </w:tabs>
     </w:pPr>
     <w:r>
-      <w:t xml:space="preserve">Vikash </w:t>
-    </w:r>
-    <w:proofErr w:type="gramStart"/>
-    <w:r>
-      <w:t>Vashisth  |</w:t>
-    </w:r>
-    <w:proofErr w:type="gramEnd"/>
-    <w:r>
-      <w:t xml:space="preserve">  CFD Engineer</w:t>
+      <w:t>Vikash Vashisth  |  CFD Engineer</w:t>
     </w:r>
     <w:r>
       <w:tab/>

</xml_diff>

<commit_message>
Use the supplied revised CV for the portfolio download
</commit_message>
<xml_diff>
--- a/cv/Vikash_Vashisth_CFD_Thermal_Fluid_Engineer_CV.docx
+++ b/cv/Vikash_Vashisth_CFD_Thermal_Fluid_Engineer_CV.docx
@@ -6,14 +6,14 @@
       <w:pPr>
         <w:pStyle w:val="CVName"/>
         <w:rPr>
-          <w:sz w:val="44"/>
-          <w:szCs w:val="28"/>
+          <w:sz w:val="48"/>
+          <w:szCs w:val="32"/>
         </w:rPr>
       </w:pPr>
       <w:r>
         <w:rPr>
-          <w:sz w:val="44"/>
-          <w:szCs w:val="28"/>
+          <w:sz w:val="48"/>
+          <w:szCs w:val="32"/>
         </w:rPr>
         <w:t>Vikash Vashisth</w:t>
       </w:r>
@@ -31,7 +31,8 @@
         <w:rPr>
           <w:b/>
           <w:color w:val="17567B"/>
-          <w:sz w:val="22"/>
+          <w:sz w:val="20"/>
+          <w:szCs w:val="20"/>
         </w:rPr>
         <w:t>CFD Engineer | Thermal-Fluid and Multiphysics Simulation</w:t>
       </w:r>
@@ -47,25 +48,41 @@
     <w:p>
       <w:pPr>
         <w:pStyle w:val="CVContact"/>
+        <w:rPr>
+          <w:sz w:val="18"/>
+          <w:szCs w:val="24"/>
+        </w:rPr>
       </w:pPr>
       <w:r>
+        <w:rPr>
+          <w:sz w:val="18"/>
+          <w:szCs w:val="24"/>
+        </w:rPr>
         <w:t xml:space="preserve">Gothenburg, Sweden | +46 72 931 16 34 | vikasche.engg@gmail.com | </w:t>
       </w:r>
       <w:hyperlink r:id="rId8" w:history="1">
         <w:r>
           <w:rPr>
             <w:rStyle w:val="Hyperlink"/>
+            <w:sz w:val="18"/>
+            <w:szCs w:val="24"/>
           </w:rPr>
           <w:t>LinkedIn</w:t>
         </w:r>
       </w:hyperlink>
       <w:r>
+        <w:rPr>
+          <w:sz w:val="18"/>
+          <w:szCs w:val="24"/>
+        </w:rPr>
         <w:t xml:space="preserve"> | </w:t>
       </w:r>
       <w:hyperlink r:id="rId9" w:history="1">
         <w:r>
           <w:rPr>
             <w:rStyle w:val="Hyperlink"/>
+            <w:sz w:val="18"/>
+            <w:szCs w:val="24"/>
           </w:rPr>
           <w:t>CFD Portfolio</w:t>
         </w:r>
@@ -73,10 +90,32 @@
     </w:p>
     <w:p>
       <w:pPr>
+        <w:pStyle w:val="CVContact"/>
+        <w:spacing w:before="60" w:after="40"/>
+      </w:pPr>
+      <w:r>
+        <w:rPr>
+          <w:b/>
+          <w:color w:val="000000"/>
+          <w:sz w:val="18"/>
+        </w:rPr>
+        <w:t xml:space="preserve">Work authorization: </w:t>
+      </w:r>
+      <w:r>
+        <w:rPr>
+          <w:color w:val="000000"/>
+          <w:sz w:val="18"/>
+        </w:rPr>
+        <w:t>Authorized to work in Sweden. No employer sponsorship required to start employment.</w:t>
+      </w:r>
+    </w:p>
+    <w:p>
+      <w:pPr>
         <w:pStyle w:val="CVSection"/>
         <w:pBdr>
           <w:bottom w:val="single" w:sz="5" w:space="3" w:color="D2DAE1"/>
         </w:pBdr>
+        <w:spacing w:before="200" w:after="100"/>
       </w:pPr>
       <w:r>
         <w:t>PROFESSIONAL SUMMARY</w:t>
@@ -85,12 +124,17 @@
     <w:p>
       <w:pPr>
         <w:pStyle w:val="CVBody"/>
+        <w:rPr>
+          <w:sz w:val="19"/>
+          <w:szCs w:val="19"/>
+        </w:rPr>
       </w:pPr>
       <w:r>
-        <w:t>CFD engineer with a PhD in Chemical Engineering and experience in academic and industry-linked R&amp;D, specialising in thermal-fluid analysis, reacting and multiphase flows, turbulence modelling and heat transfer. Combines numerical verification, mesh-independence assessment and experimental validation to evaluate equipment performance and inform design and operating decisions. Advanced ANSYS Fluent expertise, complemented by STAR-CCM+, electromagnetic-CFD analysis and Python-based simulation automation</w:t>
-      </w:r>
-      <w:r>
-        <w:t>.</w:t>
+        <w:rPr>
+          <w:sz w:val="19"/>
+          <w:szCs w:val="19"/>
+        </w:rPr>
+        <w:t>CFD engineer with a PhD in Chemical Engineering and experience in academic and industry-linked R&amp;D. Uses ANSYS Fluent, STAR-CCM+ and Python automation to evaluate thermal-fluid performance and compare equipment designs. Combines numerical verification, experimental validation and physical interpretation to support engineering decisions.</w:t>
       </w:r>
     </w:p>
     <w:p>
@@ -99,6 +143,7 @@
         <w:pBdr>
           <w:bottom w:val="single" w:sz="5" w:space="3" w:color="D2DAE1"/>
         </w:pBdr>
+        <w:spacing w:before="200" w:after="100"/>
       </w:pPr>
       <w:r>
         <w:t>CORE EXPERTISE</w:t>
@@ -107,91 +152,135 @@
     <w:p>
       <w:pPr>
         <w:pStyle w:val="CVBody"/>
+        <w:rPr>
+          <w:sz w:val="19"/>
+          <w:szCs w:val="19"/>
+        </w:rPr>
       </w:pPr>
       <w:r>
         <w:rPr>
-          <w:b/>
+          <w:bCs/>
+          <w:sz w:val="19"/>
+          <w:szCs w:val="19"/>
         </w:rPr>
-        <w:t>Physics</w:t>
+        <w:t xml:space="preserve">Applications: </w:t>
       </w:r>
       <w:r>
         <w:rPr>
-          <w:b/>
+          <w:sz w:val="19"/>
+          <w:szCs w:val="19"/>
         </w:rPr>
-        <w:t xml:space="preserve">: </w:t>
+        <w:t>Fluid dynamics; t</w:t>
       </w:r>
       <w:r>
         <w:rPr>
-          <w:bCs/>
+          <w:sz w:val="19"/>
+          <w:szCs w:val="19"/>
         </w:rPr>
-        <w:t>Reacting</w:t>
-      </w:r>
-      <w:r>
-        <w:t xml:space="preserve"> flows</w:t>
-      </w:r>
-      <w:r>
-        <w:t>;</w:t>
-      </w:r>
-      <w:r>
-        <w:t xml:space="preserve"> </w:t>
-      </w:r>
-      <w:r>
-        <w:rPr>
-          <w:bCs/>
-        </w:rPr>
-        <w:t xml:space="preserve">Plasma CFD </w:t>
-      </w:r>
-      <w:r>
-        <w:t xml:space="preserve">and finite-rate chemistry; multiphase; heat and mass transfer; thermal management; species transport; rotating </w:t>
-      </w:r>
-      <w:r>
-        <w:t xml:space="preserve">machinery </w:t>
-      </w:r>
-      <w:r>
-        <w:t>and non-Newtonian flows.</w:t>
+        <w:t>hermal management and conjugate heat transfer; reacting and multiphase flows; rotating machinery; non-Newtonian flows.</w:t>
       </w:r>
     </w:p>
     <w:p>
       <w:pPr>
         <w:pStyle w:val="CVBody"/>
+        <w:rPr>
+          <w:sz w:val="19"/>
+          <w:szCs w:val="19"/>
+        </w:rPr>
       </w:pPr>
       <w:r>
         <w:rPr>
-          <w:b/>
+          <w:bCs/>
+          <w:sz w:val="19"/>
+          <w:szCs w:val="19"/>
         </w:rPr>
-        <w:t xml:space="preserve">Methods: </w:t>
+        <w:t>Methods: R</w:t>
       </w:r>
       <w:r>
-        <w:t xml:space="preserve">RANS/LES; </w:t>
-      </w:r>
-      <w:r>
-        <w:t xml:space="preserve">steady and </w:t>
-      </w:r>
-      <w:r>
-        <w:t xml:space="preserve">transient </w:t>
-      </w:r>
-      <w:r>
-        <w:t xml:space="preserve">CFD; </w:t>
-      </w:r>
-      <w:r>
-        <w:t>sliding-mesh; adaptive mesh refinement; mesh-independence assessment; convergence and conservation; experimental validation; HPC.</w:t>
+        <w:rPr>
+          <w:sz w:val="19"/>
+          <w:szCs w:val="19"/>
+        </w:rPr>
+        <w:t>ANS/LES; VOF; finite-rate chemistry; sliding mesh; adaptive refinement; mesh independence; convergence and conservation checks; experimental validation.</w:t>
       </w:r>
     </w:p>
     <w:p>
       <w:pPr>
         <w:pStyle w:val="CVBody"/>
+        <w:rPr>
+          <w:sz w:val="19"/>
+          <w:szCs w:val="19"/>
+        </w:rPr>
       </w:pPr>
       <w:r>
         <w:rPr>
-          <w:b/>
+          <w:bCs/>
+          <w:sz w:val="19"/>
+          <w:szCs w:val="19"/>
         </w:rPr>
-        <w:t xml:space="preserve">Software: </w:t>
+        <w:t>Tools: AN</w:t>
       </w:r>
       <w:r>
-        <w:t>ANSYS Fluent</w:t>
+        <w:rPr>
+          <w:sz w:val="19"/>
+          <w:szCs w:val="19"/>
+        </w:rPr>
+        <w:t xml:space="preserve">SYS Fluent; STAR-CCM+; HFSS; Python, </w:t>
+      </w:r>
+      <w:proofErr w:type="spellStart"/>
+      <w:r>
+        <w:rPr>
+          <w:sz w:val="19"/>
+          <w:szCs w:val="19"/>
+        </w:rPr>
+        <w:t>PyFluent</w:t>
+      </w:r>
+      <w:proofErr w:type="spellEnd"/>
+      <w:r>
+        <w:rPr>
+          <w:sz w:val="19"/>
+          <w:szCs w:val="19"/>
+        </w:rPr>
+        <w:t xml:space="preserve"> and </w:t>
+      </w:r>
+      <w:proofErr w:type="spellStart"/>
+      <w:r>
+        <w:rPr>
+          <w:sz w:val="19"/>
+          <w:szCs w:val="19"/>
+        </w:rPr>
+        <w:t>PyAEDT</w:t>
+      </w:r>
+      <w:proofErr w:type="spellEnd"/>
+      <w:r>
+        <w:rPr>
+          <w:sz w:val="19"/>
+          <w:szCs w:val="19"/>
+        </w:rPr>
+        <w:t xml:space="preserve">; MATLAB; UDF/C; Siemens NX; ANSYS meshing </w:t>
       </w:r>
       <w:r>
-        <w:t>; STAR-CCM+; ANSYS HFSS; Python, PyFluent and PyAEDT; MATLAB; UDF/C; Siemens NX; Workbench, Meshing, DesignModeler; Linux.</w:t>
+        <w:rPr>
+          <w:sz w:val="19"/>
+          <w:szCs w:val="19"/>
+        </w:rPr>
+        <w:t xml:space="preserve">and </w:t>
+      </w:r>
+      <w:proofErr w:type="spellStart"/>
+      <w:r>
+        <w:rPr>
+          <w:sz w:val="19"/>
+          <w:szCs w:val="19"/>
+        </w:rPr>
+        <w:t>DesignModeler</w:t>
+      </w:r>
+      <w:proofErr w:type="spellEnd"/>
+      <w:r>
+        <w:rPr>
+          <w:sz w:val="19"/>
+          <w:szCs w:val="19"/>
+        </w:rPr>
+        <w:t>; HPC.</w:t>
       </w:r>
     </w:p>
     <w:p>
@@ -200,6 +289,7 @@
         <w:pBdr>
           <w:bottom w:val="single" w:sz="5" w:space="3" w:color="D2DAE1"/>
         </w:pBdr>
+        <w:spacing w:before="200" w:after="100"/>
       </w:pPr>
       <w:r>
         <w:t>PROFESSIONAL EXPERIENCE</w:t>
@@ -213,6 +303,10 @@
         </w:tabs>
       </w:pPr>
       <w:r>
+        <w:rPr>
+          <w:sz w:val="19"/>
+          <w:szCs w:val="19"/>
+        </w:rPr>
         <w:t>Chalmers University of Technology</w:t>
       </w:r>
       <w:r>
@@ -222,6 +316,14 @@
           <w:sz w:val="17"/>
         </w:rPr>
         <w:tab/>
+      </w:r>
+      <w:r>
+        <w:rPr>
+          <w:b w:val="0"/>
+          <w:color w:val="42525E"/>
+          <w:sz w:val="18"/>
+          <w:szCs w:val="24"/>
+        </w:rPr>
         <w:t>Gothenburg, Sweden</w:t>
       </w:r>
     </w:p>
@@ -260,15 +362,121 @@
         <w:pStyle w:val="CVBullet"/>
         <w:keepLines/>
         <w:ind w:left="210" w:hanging="130"/>
+        <w:rPr>
+          <w:sz w:val="19"/>
+          <w:szCs w:val="19"/>
+        </w:rPr>
       </w:pPr>
       <w:r>
-        <w:t xml:space="preserve">•  </w:t>
+        <w:rPr>
+          <w:sz w:val="19"/>
+          <w:szCs w:val="19"/>
+        </w:rPr>
+        <w:t>•  Evaluated microwave plasma-reactor performance by developing 3D CFD models of coupled flow, heat transfer and nitrogen-fixation chemistry; validated predictions against experimental measurements.</w:t>
       </w:r>
+    </w:p>
+    <w:p>
+      <w:pPr>
+        <w:pStyle w:val="CVBullet"/>
+        <w:keepLines/>
+        <w:ind w:left="210" w:hanging="130"/>
+        <w:rPr>
+          <w:sz w:val="19"/>
+          <w:szCs w:val="19"/>
+        </w:rPr>
+      </w:pPr>
       <w:r>
-        <w:t>Modelled and experimentally validated microwave plasma reactors using 3D CFD, incorporating fluid flow, heat transfer, species transport and finite-rate chemistry</w:t>
+        <w:rPr>
+          <w:sz w:val="19"/>
+          <w:szCs w:val="19"/>
+        </w:rPr>
+        <w:t>•  Evaluated forced-jet quenching to limit downstream NO destruction. Compared with the intrinsic-quenching baseline, CFD predicted 6-10% higher NO yield and 6-8% lower specific energy consumption.</w:t>
       </w:r>
+    </w:p>
+    <w:p>
+      <w:pPr>
+        <w:pStyle w:val="CVBullet"/>
+        <w:keepLines/>
+        <w:ind w:left="210" w:hanging="130"/>
+        <w:rPr>
+          <w:sz w:val="19"/>
+          <w:szCs w:val="19"/>
+        </w:rPr>
+      </w:pPr>
       <w:r>
-        <w:t>.</w:t>
+        <w:rPr>
+          <w:sz w:val="19"/>
+          <w:szCs w:val="19"/>
+        </w:rPr>
+        <w:t xml:space="preserve">•  Developed fully automated two-way HFSS-Fluent coupling using </w:t>
+      </w:r>
+      <w:proofErr w:type="spellStart"/>
+      <w:r>
+        <w:rPr>
+          <w:sz w:val="19"/>
+          <w:szCs w:val="19"/>
+        </w:rPr>
+        <w:t>PyAEDT</w:t>
+      </w:r>
+      <w:proofErr w:type="spellEnd"/>
+      <w:r>
+        <w:rPr>
+          <w:sz w:val="19"/>
+          <w:szCs w:val="19"/>
+        </w:rPr>
+        <w:t xml:space="preserve"> and </w:t>
+      </w:r>
+      <w:proofErr w:type="spellStart"/>
+      <w:r>
+        <w:rPr>
+          <w:sz w:val="19"/>
+          <w:szCs w:val="19"/>
+        </w:rPr>
+        <w:t>PyFluent</w:t>
+      </w:r>
+      <w:proofErr w:type="spellEnd"/>
+      <w:r>
+        <w:rPr>
+          <w:sz w:val="19"/>
+          <w:szCs w:val="19"/>
+        </w:rPr>
+        <w:t xml:space="preserve">, integrating electromagnetic power deposition with fluid flow, heat transfer and finite-rate chemistry. </w:t>
+      </w:r>
+    </w:p>
+    <w:p>
+      <w:pPr>
+        <w:pStyle w:val="CVBullet"/>
+        <w:keepLines/>
+        <w:ind w:left="210" w:hanging="130"/>
+        <w:rPr>
+          <w:sz w:val="19"/>
+          <w:szCs w:val="19"/>
+        </w:rPr>
+      </w:pPr>
+      <w:r>
+        <w:rPr>
+          <w:sz w:val="19"/>
+          <w:szCs w:val="19"/>
+        </w:rPr>
+        <w:t>•  Investigated turbulent bubble and droplet breakup and fragment formation; designed and ran LES-VOF simulations with adaptive mesh refinement to resolve interface dynamics and fragment-size distributions.</w:t>
+      </w:r>
+    </w:p>
+    <w:p>
+      <w:pPr>
+        <w:pStyle w:val="CVBullet"/>
+        <w:keepLines/>
+        <w:ind w:left="210" w:hanging="130"/>
+        <w:rPr>
+          <w:sz w:val="19"/>
+          <w:szCs w:val="19"/>
+        </w:rPr>
+      </w:pPr>
+      <w:r>
+        <w:rPr>
+          <w:sz w:val="19"/>
+          <w:szCs w:val="19"/>
+        </w:rPr>
+        <w:t>•  Verified LES resolution and numerical sensitivity, and validated breakup predictions against high-speed experimental measurements.</w:t>
       </w:r>
     </w:p>
     <w:p>
@@ -278,98 +486,27 @@
         <w:ind w:left="210" w:hanging="130"/>
       </w:pPr>
       <w:r>
-        <w:t xml:space="preserve">•  </w:t>
+        <w:rPr>
+          <w:sz w:val="19"/>
+          <w:szCs w:val="19"/>
+        </w:rPr>
+        <w:t xml:space="preserve">•  Led biweekly CFD reviews with </w:t>
       </w:r>
+      <w:proofErr w:type="spellStart"/>
       <w:r>
-        <w:t>Quantified reactor performance, predicting 6-10% higher NO yield and 6-8% lower specific energy consumption relative to reference configurations</w:t>
+        <w:rPr>
+          <w:sz w:val="19"/>
+          <w:szCs w:val="19"/>
+        </w:rPr>
+        <w:t>NitroCapt</w:t>
       </w:r>
+      <w:proofErr w:type="spellEnd"/>
       <w:r>
-        <w:t>.</w:t>
-      </w:r>
-    </w:p>
-    <w:p>
-      <w:pPr>
-        <w:pStyle w:val="CVBullet"/>
-        <w:keepLines/>
-        <w:ind w:left="210" w:hanging="130"/>
-      </w:pPr>
-      <w:r>
-        <w:t>•  Developed fully automated two-way HFSS-Fluent coupling using PyAEDT and PyFluent, integrating electromagnetic power deposition with fluid flow, heat transfer and finite-rate chemistry.</w:t>
-      </w:r>
-      <w:r>
-        <w:t xml:space="preserve"> </w:t>
-      </w:r>
-    </w:p>
-    <w:p>
-      <w:pPr>
-        <w:pStyle w:val="CVBullet"/>
-        <w:keepLines/>
-        <w:ind w:left="210" w:hanging="130"/>
-      </w:pPr>
-      <w:r>
-        <w:t xml:space="preserve">•  </w:t>
-      </w:r>
-      <w:r>
-        <w:t xml:space="preserve">Simulated </w:t>
-      </w:r>
-      <w:r>
-        <w:t xml:space="preserve">multiphase </w:t>
-      </w:r>
-      <w:r>
-        <w:t>bubble and droplet breakup using LES-VOF and adaptive mesh refinement, predicting interface dynamics and fragment-size distributions</w:t>
-      </w:r>
-      <w:r>
-        <w:t>.</w:t>
-      </w:r>
-    </w:p>
-    <w:p>
-      <w:pPr>
-        <w:pStyle w:val="CVBullet"/>
-        <w:keepLines/>
-        <w:ind w:left="210" w:hanging="130"/>
-      </w:pPr>
-      <w:r>
-        <w:t xml:space="preserve">•  </w:t>
-      </w:r>
-      <w:r>
-        <w:t>Verified LES resolution and numerical sensitivity, and validated predictions against high-speed experimental measurements</w:t>
-      </w:r>
-      <w:r>
-        <w:t>.</w:t>
-      </w:r>
-    </w:p>
-    <w:p>
-      <w:pPr>
-        <w:pStyle w:val="CVBullet"/>
-        <w:keepLines/>
-        <w:ind w:left="210" w:hanging="130"/>
-      </w:pPr>
-      <w:r>
-        <w:t xml:space="preserve">•  </w:t>
-      </w:r>
-      <w:r>
-        <w:t>Led biweekly CFD reviews with NitroCapt AB and research partners, presenting simulation results and engineering recommendations</w:t>
-      </w:r>
-      <w:r>
-        <w:t>.</w:t>
-      </w:r>
-    </w:p>
-    <w:p>
-      <w:r>
-        <w:br w:type="page"/>
-      </w:r>
-    </w:p>
-    <w:p>
-      <w:pPr>
-        <w:pStyle w:val="CVSection"/>
-        <w:pBdr>
-          <w:bottom w:val="single" w:sz="5" w:space="3" w:color="D2DAE1"/>
-        </w:pBdr>
-        <w:spacing w:before="180"/>
-      </w:pPr>
-      <w:r>
-        <w:lastRenderedPageBreak/>
-        <w:t>PROFESSIONAL EXPERIENCE - CONTINUED</w:t>
+        <w:rPr>
+          <w:sz w:val="19"/>
+          <w:szCs w:val="19"/>
+        </w:rPr>
+        <w:t xml:space="preserve"> AB and research partners, explaining model results and presenting engineering recommendations.</w:t>
       </w:r>
     </w:p>
     <w:p>
@@ -378,17 +515,34 @@
         <w:tabs>
           <w:tab w:val="right" w:pos="9865"/>
         </w:tabs>
+        <w:rPr>
+          <w:b w:val="0"/>
+          <w:color w:val="42525E"/>
+          <w:sz w:val="18"/>
+          <w:szCs w:val="24"/>
+        </w:rPr>
       </w:pPr>
       <w:r>
+        <w:rPr>
+          <w:sz w:val="19"/>
+          <w:szCs w:val="19"/>
+        </w:rPr>
         <w:t>IIT Guwahati - Reckitt Benckiser Collaboration</w:t>
+      </w:r>
+      <w:r>
+        <w:rPr>
+          <w:sz w:val="19"/>
+          <w:szCs w:val="19"/>
+        </w:rPr>
+        <w:tab/>
       </w:r>
       <w:r>
         <w:rPr>
           <w:b w:val="0"/>
           <w:color w:val="42525E"/>
-          <w:sz w:val="17"/>
+          <w:sz w:val="18"/>
+          <w:szCs w:val="24"/>
         </w:rPr>
-        <w:tab/>
         <w:t>Guwahati, India</w:t>
       </w:r>
     </w:p>
@@ -412,12 +566,17 @@
         <w:pStyle w:val="CVBullet"/>
         <w:keepLines/>
         <w:ind w:left="210" w:hanging="130"/>
+        <w:rPr>
+          <w:sz w:val="19"/>
+          <w:szCs w:val="19"/>
+        </w:rPr>
       </w:pPr>
       <w:r>
-        <w:t xml:space="preserve">•  </w:t>
-      </w:r>
-      <w:r>
-        <w:t>Simulated shear-thinning liquid spreading using transient 3D VOF with experimentally measured rheology.</w:t>
+        <w:rPr>
+          <w:sz w:val="19"/>
+          <w:szCs w:val="19"/>
+        </w:rPr>
+        <w:t>•  Investigated shear-thinning liquid spreading for the Reckitt Benckiser collaboration; built transient 3D VOF models using experimentally measured rheology.</w:t>
       </w:r>
     </w:p>
     <w:p>
@@ -425,14 +584,46 @@
         <w:pStyle w:val="CVBullet"/>
         <w:keepLines/>
         <w:ind w:left="210" w:hanging="130"/>
+        <w:rPr>
+          <w:sz w:val="19"/>
+          <w:szCs w:val="19"/>
+        </w:rPr>
       </w:pPr>
       <w:r>
+        <w:rPr>
+          <w:sz w:val="19"/>
+          <w:szCs w:val="19"/>
+        </w:rPr>
         <w:t xml:space="preserve">•  </w:t>
       </w:r>
       <w:r>
-        <w:t>Established mesh-independent predictions and validated liquid-spreading behaviour against experimental measurements</w:t>
+        <w:rPr>
+          <w:sz w:val="19"/>
+          <w:szCs w:val="19"/>
+        </w:rPr>
+        <w:t xml:space="preserve">Established mesh-independent predictions and validated liquid-spreading </w:t>
+      </w:r>
+      <w:proofErr w:type="spellStart"/>
+      <w:r>
+        <w:rPr>
+          <w:sz w:val="19"/>
+          <w:szCs w:val="19"/>
+        </w:rPr>
+        <w:t>behaviour</w:t>
+      </w:r>
+      <w:proofErr w:type="spellEnd"/>
+      <w:r>
+        <w:rPr>
+          <w:sz w:val="19"/>
+          <w:szCs w:val="19"/>
+        </w:rPr>
+        <w:t xml:space="preserve"> against experimental measurements</w:t>
       </w:r>
       <w:r>
+        <w:rPr>
+          <w:sz w:val="19"/>
+          <w:szCs w:val="19"/>
+        </w:rPr>
         <w:t>.</w:t>
       </w:r>
     </w:p>
@@ -442,32 +633,49 @@
         <w:tabs>
           <w:tab w:val="right" w:pos="9865"/>
         </w:tabs>
+        <w:rPr>
+          <w:b w:val="0"/>
+          <w:color w:val="42525E"/>
+          <w:sz w:val="18"/>
+          <w:szCs w:val="24"/>
+        </w:rPr>
       </w:pPr>
       <w:r>
+        <w:rPr>
+          <w:sz w:val="19"/>
+          <w:szCs w:val="19"/>
+        </w:rPr>
         <w:t>I</w:t>
       </w:r>
       <w:r>
+        <w:rPr>
+          <w:sz w:val="19"/>
+          <w:szCs w:val="19"/>
+        </w:rPr>
         <w:t>IT</w:t>
       </w:r>
       <w:r>
+        <w:rPr>
+          <w:sz w:val="19"/>
+          <w:szCs w:val="19"/>
+        </w:rPr>
         <w:t xml:space="preserve"> Roorkee</w:t>
       </w:r>
       <w:r>
         <w:rPr>
           <w:b w:val="0"/>
-          <w:color w:val="42525E"/>
           <w:sz w:val="17"/>
         </w:rPr>
         <w:tab/>
-        <w:t>Roorkee</w:t>
       </w:r>
       <w:r>
         <w:rPr>
           <w:b w:val="0"/>
           <w:color w:val="42525E"/>
-          <w:sz w:val="17"/>
+          <w:sz w:val="18"/>
+          <w:szCs w:val="24"/>
         </w:rPr>
-        <w:t>, India</w:t>
+        <w:t>Roorkee, India</w:t>
       </w:r>
     </w:p>
     <w:p>
@@ -496,30 +704,17 @@
         <w:pStyle w:val="CVBullet"/>
         <w:keepLines/>
         <w:ind w:left="210" w:hanging="130"/>
+        <w:rPr>
+          <w:sz w:val="19"/>
+          <w:szCs w:val="19"/>
+        </w:rPr>
       </w:pPr>
       <w:r>
-        <w:t xml:space="preserve">•  </w:t>
-      </w:r>
-      <w:r>
-        <w:t xml:space="preserve">Analysed rotor-stator mixer performance using sliding-mesh RANS and LES, evaluating </w:t>
-      </w:r>
-      <w:r>
-        <w:t>mesh-</w:t>
-      </w:r>
-      <w:r>
-        <w:t xml:space="preserve">independence, </w:t>
-      </w:r>
-      <w:r>
-        <w:t xml:space="preserve">flow distribution, mixing efficiency and power consumption across </w:t>
-      </w:r>
-      <w:r>
-        <w:t xml:space="preserve">mixer </w:t>
-      </w:r>
-      <w:r>
-        <w:t>designs</w:t>
-      </w:r>
-      <w:r>
-        <w:t>.</w:t>
+        <w:rPr>
+          <w:sz w:val="19"/>
+          <w:szCs w:val="19"/>
+        </w:rPr>
+        <w:t>•  Evaluated how rotor-stator geometry affects mixing and power demand using sliding-mesh RANS and LES; assessed flow distribution, mixing performance and mesh independence.</w:t>
       </w:r>
     </w:p>
     <w:p>
@@ -527,21 +722,17 @@
         <w:pStyle w:val="CVBullet"/>
         <w:keepLines/>
         <w:ind w:left="210" w:hanging="130"/>
+        <w:rPr>
+          <w:sz w:val="19"/>
+          <w:szCs w:val="19"/>
+        </w:rPr>
       </w:pPr>
       <w:r>
-        <w:t xml:space="preserve">•  </w:t>
-      </w:r>
-      <w:r>
-        <w:t xml:space="preserve">Compared conventional and </w:t>
-      </w:r>
-      <w:r>
-        <w:t>newly developed</w:t>
-      </w:r>
-      <w:r>
-        <w:t xml:space="preserve"> configurations, with predicted power numbers agreeing within approximately 10% of benchmark measurements</w:t>
-      </w:r>
-      <w:r>
-        <w:t>.</w:t>
+        <w:rPr>
+          <w:sz w:val="19"/>
+          <w:szCs w:val="19"/>
+        </w:rPr>
+        <w:t>•  Benchmarked predicted power demand for conventional and newly developed mixer configurations; power numbers agreed within approximately 10% of measurements.</w:t>
       </w:r>
     </w:p>
     <w:p>
@@ -550,9 +741,10 @@
         <w:pBdr>
           <w:bottom w:val="single" w:sz="5" w:space="3" w:color="D2DAE1"/>
         </w:pBdr>
-        <w:spacing w:before="180"/>
+        <w:spacing w:before="200" w:after="100"/>
       </w:pPr>
       <w:r>
+        <w:lastRenderedPageBreak/>
         <w:t>SELECTED ENGINEERING PROJECT</w:t>
       </w:r>
     </w:p>
@@ -562,17 +754,34 @@
         <w:tabs>
           <w:tab w:val="right" w:pos="9865"/>
         </w:tabs>
+        <w:rPr>
+          <w:b w:val="0"/>
+          <w:color w:val="42525E"/>
+          <w:sz w:val="18"/>
+          <w:szCs w:val="24"/>
+        </w:rPr>
       </w:pPr>
       <w:r>
+        <w:rPr>
+          <w:sz w:val="19"/>
+          <w:szCs w:val="19"/>
+        </w:rPr>
         <w:t>Electric Drive Unit Cooling Jacket - Conjugate Heat Transfer</w:t>
       </w:r>
       <w:r>
         <w:rPr>
           <w:b w:val="0"/>
-          <w:color w:val="42525E"/>
           <w:sz w:val="17"/>
         </w:rPr>
         <w:tab/>
+      </w:r>
+      <w:r>
+        <w:rPr>
+          <w:b w:val="0"/>
+          <w:color w:val="42525E"/>
+          <w:sz w:val="18"/>
+          <w:szCs w:val="24"/>
+        </w:rPr>
         <w:t>2026</w:t>
       </w:r>
     </w:p>
@@ -589,15 +798,17 @@
         <w:pStyle w:val="CVBullet"/>
         <w:keepLines/>
         <w:ind w:left="210" w:hanging="130"/>
+        <w:rPr>
+          <w:sz w:val="19"/>
+          <w:szCs w:val="19"/>
+        </w:rPr>
       </w:pPr>
       <w:r>
-        <w:t xml:space="preserve">•  </w:t>
-      </w:r>
-      <w:r>
-        <w:t>Built a liquid-cooled electric drive unit CHT model in STAR-CCM+, coupling coolant flow with heat conduction through the housing and equivalent stator</w:t>
-      </w:r>
-      <w:r>
-        <w:t>.</w:t>
+        <w:rPr>
+          <w:sz w:val="19"/>
+          <w:szCs w:val="19"/>
+        </w:rPr>
+        <w:t>•  Evaluated liquid cooling of an electric drive unit; built a STAR-CCM+ conjugate heat-transfer model coupling coolant flow with conduction through the housing and equivalent stator.</w:t>
       </w:r>
     </w:p>
     <w:p>
@@ -605,8 +816,16 @@
         <w:pStyle w:val="CVBullet"/>
         <w:keepLines/>
         <w:ind w:left="210" w:hanging="130"/>
+        <w:rPr>
+          <w:sz w:val="19"/>
+          <w:szCs w:val="19"/>
+        </w:rPr>
       </w:pPr>
       <w:r>
+        <w:rPr>
+          <w:sz w:val="19"/>
+          <w:szCs w:val="19"/>
+        </w:rPr>
         <w:t>•  Established mesh-independent CFD predictions and evaluated cooling-channel geometry variations.</w:t>
       </w:r>
     </w:p>
@@ -615,18 +834,17 @@
         <w:pStyle w:val="CVBullet"/>
         <w:keepLines/>
         <w:ind w:left="210" w:hanging="130"/>
+        <w:rPr>
+          <w:sz w:val="19"/>
+          <w:szCs w:val="19"/>
+        </w:rPr>
       </w:pPr>
       <w:r>
-        <w:t xml:space="preserve">•  </w:t>
-      </w:r>
-      <w:r>
-        <w:t>Quantified the cooling-versus-pressure-loss trade-off: seven turns reduced peak equivalent-stator temperature by 1.4 K while increasing pressure loss by 16.2% relative to the six-turn reference</w:t>
-      </w:r>
-      <w:r>
-        <w:t xml:space="preserve"> case</w:t>
-      </w:r>
-      <w:r>
-        <w:t>.</w:t>
+        <w:rPr>
+          <w:sz w:val="19"/>
+          <w:szCs w:val="19"/>
+        </w:rPr>
+        <w:t>•  Evaluated cooling gains against pressure losses from additional channel turns. At 0.110 kg/s, seven versus six turns reduced predicted peak equivalent-stator temperature by 1.4 K and increased pressure loss by 16.2%.</w:t>
       </w:r>
     </w:p>
     <w:p>
@@ -635,7 +853,7 @@
         <w:pBdr>
           <w:bottom w:val="single" w:sz="5" w:space="3" w:color="D2DAE1"/>
         </w:pBdr>
-        <w:spacing w:before="180"/>
+        <w:spacing w:before="200" w:after="100"/>
       </w:pPr>
       <w:r>
         <w:t>EDUCATION</w:t>
@@ -647,16 +865,34 @@
         <w:tabs>
           <w:tab w:val="right" w:pos="9865"/>
         </w:tabs>
+        <w:rPr>
+          <w:b w:val="0"/>
+          <w:color w:val="42525E"/>
+          <w:sz w:val="18"/>
+          <w:szCs w:val="24"/>
+        </w:rPr>
       </w:pPr>
       <w:r>
+        <w:rPr>
+          <w:sz w:val="19"/>
+          <w:szCs w:val="19"/>
+        </w:rPr>
         <w:t>Indian Institute of Technology Roorkee</w:t>
       </w:r>
       <w:r>
         <w:rPr>
-          <w:b w:val="0"/>
-          <w:sz w:val="17"/>
+          <w:sz w:val="19"/>
+          <w:szCs w:val="19"/>
         </w:rPr>
         <w:tab/>
+      </w:r>
+      <w:r>
+        <w:rPr>
+          <w:b w:val="0"/>
+          <w:color w:val="42525E"/>
+          <w:sz w:val="18"/>
+          <w:szCs w:val="24"/>
+        </w:rPr>
         <w:t>Roorkee, India</w:t>
       </w:r>
     </w:p>
@@ -668,6 +904,10 @@
         </w:tabs>
       </w:pPr>
       <w:r>
+        <w:rPr>
+          <w:sz w:val="19"/>
+          <w:szCs w:val="19"/>
+        </w:rPr>
         <w:t>PhD, Chemical Engineering</w:t>
       </w:r>
       <w:r>
@@ -677,21 +917,26 @@
     </w:p>
     <w:p>
       <w:pPr>
-        <w:pStyle w:val="CVPub"/>
-      </w:pPr>
-      <w:r>
-        <w:t>Thesis: Hydrodynamics and Mixing Studies in High Shear Mixers for Viscous Fluids</w:t>
-      </w:r>
-    </w:p>
-    <w:p>
-      <w:pPr>
         <w:pStyle w:val="CVPosition"/>
         <w:tabs>
           <w:tab w:val="right" w:pos="9865"/>
         </w:tabs>
       </w:pPr>
+      <w:proofErr w:type="spellStart"/>
       <w:r>
-        <w:t>M.Tech, Chemical Engineering</w:t>
+        <w:rPr>
+          <w:sz w:val="19"/>
+          <w:szCs w:val="19"/>
+        </w:rPr>
+        <w:t>M.Tech</w:t>
+      </w:r>
+      <w:proofErr w:type="spellEnd"/>
+      <w:r>
+        <w:rPr>
+          <w:sz w:val="19"/>
+          <w:szCs w:val="19"/>
+        </w:rPr>
+        <w:t>, Chemical Engineering</w:t>
       </w:r>
       <w:r>
         <w:tab/>
@@ -704,7 +949,7 @@
         <w:pBdr>
           <w:bottom w:val="single" w:sz="5" w:space="3" w:color="D2DAE1"/>
         </w:pBdr>
-        <w:spacing w:before="180"/>
+        <w:spacing w:before="200" w:after="100"/>
       </w:pPr>
       <w:r>
         <w:t>SELECTED PUBLICATIONS</w:t>
@@ -712,32 +957,89 @@
     </w:p>
     <w:p>
       <w:pPr>
-        <w:pStyle w:val="CVBullet"/>
+        <w:pStyle w:val="CVPub"/>
         <w:keepLines/>
+        <w:spacing w:after="60"/>
         <w:ind w:left="210" w:hanging="130"/>
+        <w:rPr>
+          <w:sz w:val="19"/>
+          <w:szCs w:val="19"/>
+        </w:rPr>
       </w:pPr>
+      <w:hyperlink r:id="rId10">
+        <w:r>
+          <w:rPr>
+            <w:color w:val="155E75"/>
+            <w:sz w:val="19"/>
+            <w:szCs w:val="19"/>
+          </w:rPr>
+          <w:t>2026 | Forced and intrinsic quenching for nitrogen fixation</w:t>
+        </w:r>
+      </w:hyperlink>
       <w:r>
-        <w:t>•  Analysis of forced and intrinsic quenching in a plasma reactor for nitrogen fixation by use of three-dimensional simulations and experiments. Chemical Engineering Journal (2026).</w:t>
+        <w:rPr>
+          <w:sz w:val="19"/>
+          <w:szCs w:val="19"/>
+        </w:rPr>
+        <w:t>. Chemical Engineering Journal.</w:t>
       </w:r>
     </w:p>
     <w:p>
       <w:pPr>
-        <w:pStyle w:val="CVBullet"/>
+        <w:pStyle w:val="CVPub"/>
         <w:keepLines/>
+        <w:spacing w:after="60"/>
         <w:ind w:left="210" w:hanging="130"/>
+        <w:rPr>
+          <w:sz w:val="19"/>
+          <w:szCs w:val="19"/>
+        </w:rPr>
       </w:pPr>
+      <w:hyperlink r:id="rId11">
+        <w:r>
+          <w:rPr>
+            <w:color w:val="155E75"/>
+            <w:sz w:val="19"/>
+            <w:szCs w:val="19"/>
+          </w:rPr>
+          <w:t>2025 | Dynamics of bubble breakup under turbulent flow conditions</w:t>
+        </w:r>
+      </w:hyperlink>
       <w:r>
-        <w:t>•  Dynamics of bubble breakup under turbulent flow conditions. Chemical Engineering Journal (2025).</w:t>
+        <w:rPr>
+          <w:sz w:val="19"/>
+          <w:szCs w:val="19"/>
+        </w:rPr>
+        <w:t>. Chemical Engineering Journal.</w:t>
       </w:r>
     </w:p>
     <w:p>
       <w:pPr>
-        <w:pStyle w:val="CVBullet"/>
+        <w:pStyle w:val="CVPub"/>
         <w:keepLines/>
+        <w:spacing w:after="60"/>
         <w:ind w:left="210" w:hanging="130"/>
+        <w:rPr>
+          <w:sz w:val="19"/>
+          <w:szCs w:val="19"/>
+        </w:rPr>
       </w:pPr>
+      <w:hyperlink r:id="rId12">
+        <w:r>
+          <w:rPr>
+            <w:color w:val="155E75"/>
+            <w:sz w:val="19"/>
+            <w:szCs w:val="19"/>
+          </w:rPr>
+          <w:t>2024 | Plasma reactor performance for direct nitrogen fixation</w:t>
+        </w:r>
+      </w:hyperlink>
       <w:r>
-        <w:t>•  Analysis of a plasma reactor performance for direct nitrogen fixation by use of three-dimensional simulations and experiments. Chemical Engineering Journal (2024).</w:t>
+        <w:rPr>
+          <w:sz w:val="19"/>
+          <w:szCs w:val="19"/>
+        </w:rPr>
+        <w:t>. Chemical Engineering Journal.</w:t>
       </w:r>
     </w:p>
     <w:p>
@@ -746,7 +1048,7 @@
         <w:pBdr>
           <w:bottom w:val="single" w:sz="5" w:space="3" w:color="D2DAE1"/>
         </w:pBdr>
-        <w:spacing w:before="180"/>
+        <w:spacing w:before="200" w:after="100"/>
       </w:pPr>
       <w:r>
         <w:t>TRAINING &amp; ADDITIONAL INFORMATION</w:t>
@@ -755,35 +1057,87 @@
     <w:p>
       <w:pPr>
         <w:pStyle w:val="CVBody"/>
+        <w:rPr>
+          <w:sz w:val="19"/>
+          <w:szCs w:val="19"/>
+        </w:rPr>
       </w:pPr>
       <w:r>
         <w:rPr>
           <w:b/>
+          <w:sz w:val="19"/>
+          <w:szCs w:val="19"/>
         </w:rPr>
         <w:t xml:space="preserve">Training: </w:t>
       </w:r>
       <w:r>
-        <w:t>Ansys Learning Hub - PyFluent and HFSS (2026).</w:t>
+        <w:rPr>
+          <w:sz w:val="19"/>
+          <w:szCs w:val="19"/>
+        </w:rPr>
+        <w:t xml:space="preserve">Ansys Learning Hub - </w:t>
+      </w:r>
+      <w:proofErr w:type="spellStart"/>
+      <w:r>
+        <w:rPr>
+          <w:sz w:val="19"/>
+          <w:szCs w:val="19"/>
+        </w:rPr>
+        <w:t>PyFluent</w:t>
+      </w:r>
+      <w:proofErr w:type="spellEnd"/>
+      <w:r>
+        <w:rPr>
+          <w:sz w:val="19"/>
+          <w:szCs w:val="19"/>
+        </w:rPr>
+        <w:t xml:space="preserve"> and HFSS (2026).</w:t>
       </w:r>
     </w:p>
     <w:p>
       <w:pPr>
         <w:pStyle w:val="CVBody"/>
+        <w:rPr>
+          <w:sz w:val="19"/>
+          <w:szCs w:val="19"/>
+        </w:rPr>
       </w:pPr>
       <w:r>
         <w:rPr>
           <w:b/>
+          <w:sz w:val="19"/>
+          <w:szCs w:val="19"/>
         </w:rPr>
         <w:t xml:space="preserve">Languages and mobility: </w:t>
       </w:r>
       <w:r>
-        <w:t>English - fluent; Swedish - A2 certificate, continuing studies; Swedish driving licence (B); open to relocation.</w:t>
+        <w:rPr>
+          <w:sz w:val="19"/>
+          <w:szCs w:val="19"/>
+        </w:rPr>
+        <w:t xml:space="preserve">English - fluent; Swedish - A2 certificate, continuing studies; Swedish driving </w:t>
+      </w:r>
+      <w:proofErr w:type="spellStart"/>
+      <w:r>
+        <w:rPr>
+          <w:sz w:val="19"/>
+          <w:szCs w:val="19"/>
+        </w:rPr>
+        <w:t>licence</w:t>
+      </w:r>
+      <w:proofErr w:type="spellEnd"/>
+      <w:r>
+        <w:rPr>
+          <w:sz w:val="19"/>
+          <w:szCs w:val="19"/>
+        </w:rPr>
+        <w:t xml:space="preserve"> (B); open to relocation.</w:t>
       </w:r>
     </w:p>
     <w:sectPr>
-      <w:footerReference w:type="default" r:id="rId10"/>
+      <w:footerReference w:type="default" r:id="rId13"/>
       <w:pgSz w:w="11906" w:h="16838"/>
-      <w:pgMar w:top="935" w:right="1020" w:bottom="839" w:left="1020" w:header="397" w:footer="437" w:gutter="0"/>
+      <w:pgMar w:top="800" w:right="1020" w:bottom="800" w:left="1020" w:header="397" w:footer="437" w:gutter="0"/>
       <w:cols w:space="720"/>
       <w:docGrid w:linePitch="360"/>
     </w:sectPr>
@@ -826,7 +1180,15 @@
       </w:tabs>
     </w:pPr>
     <w:r>
-      <w:t>Vikash Vashisth  |  CFD Engineer</w:t>
+      <w:t xml:space="preserve">Vikash </w:t>
+    </w:r>
+    <w:proofErr w:type="gramStart"/>
+    <w:r>
+      <w:t>Vashisth  |</w:t>
+    </w:r>
+    <w:proofErr w:type="gramEnd"/>
+    <w:r>
+      <w:t xml:space="preserve">  CFD Engineer</w:t>
     </w:r>
     <w:r>
       <w:tab/>
@@ -1481,7 +1843,6 @@
     <w:rPr>
       <w:rFonts w:ascii="Aptos" w:hAnsi="Aptos"/>
       <w:color w:val="1D272F"/>
-      <w:sz w:val="19"/>
     </w:rPr>
   </w:style>
   <w:style w:type="paragraph" w:styleId="Heading1">
@@ -12478,11 +12839,11 @@
     <w:basedOn w:val="Normal"/>
     <w:pPr>
       <w:keepNext/>
-      <w:spacing w:after="40" w:line="274" w:lineRule="auto"/>
+      <w:spacing w:after="40" w:line="269" w:lineRule="auto"/>
     </w:pPr>
     <w:rPr>
       <w:b/>
-      <w:color w:val="1C374B"/>
+      <w:color w:val="000000"/>
       <w:sz w:val="37"/>
     </w:rPr>
   </w:style>
@@ -12491,12 +12852,11 @@
     <w:basedOn w:val="Normal"/>
     <w:pPr>
       <w:keepNext/>
-      <w:spacing w:after="120" w:line="274" w:lineRule="auto"/>
+      <w:spacing w:after="120" w:line="269" w:lineRule="auto"/>
     </w:pPr>
     <w:rPr>
       <w:b/>
-      <w:color w:val="17567B"/>
-      <w:sz w:val="22"/>
+      <w:color w:val="000000"/>
     </w:rPr>
   </w:style>
   <w:style w:type="paragraph" w:customStyle="1" w:styleId="CVContact">
@@ -12504,7 +12864,7 @@
     <w:basedOn w:val="Normal"/>
     <w:pPr>
       <w:keepNext/>
-      <w:spacing w:after="20" w:line="274" w:lineRule="auto"/>
+      <w:spacing w:after="20" w:line="269" w:lineRule="auto"/>
     </w:pPr>
     <w:rPr>
       <w:color w:val="42525E"/>
@@ -12516,11 +12876,11 @@
     <w:basedOn w:val="Normal"/>
     <w:pPr>
       <w:keepNext/>
-      <w:spacing w:before="240" w:after="120" w:line="274" w:lineRule="auto"/>
+      <w:spacing w:before="240" w:after="120" w:line="269" w:lineRule="auto"/>
     </w:pPr>
     <w:rPr>
       <w:b/>
-      <w:color w:val="1C374B"/>
+      <w:color w:val="000000"/>
       <w:sz w:val="20"/>
     </w:rPr>
   </w:style>
@@ -12529,11 +12889,11 @@
     <w:basedOn w:val="Normal"/>
     <w:pPr>
       <w:keepNext/>
-      <w:spacing w:before="140" w:after="60" w:line="274" w:lineRule="auto"/>
+      <w:spacing w:before="140" w:after="60" w:line="269" w:lineRule="auto"/>
     </w:pPr>
     <w:rPr>
       <w:b/>
-      <w:color w:val="1C374B"/>
+      <w:color w:val="000000"/>
     </w:rPr>
   </w:style>
   <w:style w:type="paragraph" w:customStyle="1" w:styleId="CVPosition">
@@ -12541,7 +12901,7 @@
     <w:basedOn w:val="Normal"/>
     <w:pPr>
       <w:keepNext/>
-      <w:spacing w:after="60" w:line="274" w:lineRule="auto"/>
+      <w:spacing w:after="60" w:line="269" w:lineRule="auto"/>
     </w:pPr>
     <w:rPr>
       <w:color w:val="42525E"/>
@@ -12552,21 +12912,21 @@
     <w:name w:val="CV Body"/>
     <w:basedOn w:val="Normal"/>
     <w:pPr>
-      <w:spacing w:after="60" w:line="274" w:lineRule="auto"/>
+      <w:spacing w:after="60" w:line="269" w:lineRule="auto"/>
     </w:pPr>
   </w:style>
   <w:style w:type="paragraph" w:customStyle="1" w:styleId="CVBullet">
     <w:name w:val="CV Bullet"/>
     <w:basedOn w:val="Normal"/>
     <w:pPr>
-      <w:spacing w:after="80" w:line="274" w:lineRule="auto"/>
+      <w:spacing w:after="80" w:line="269" w:lineRule="auto"/>
     </w:pPr>
   </w:style>
   <w:style w:type="paragraph" w:customStyle="1" w:styleId="CVEducation">
     <w:name w:val="CV Education"/>
     <w:basedOn w:val="Normal"/>
     <w:pPr>
-      <w:spacing w:after="60" w:line="274" w:lineRule="auto"/>
+      <w:spacing w:after="60" w:line="269" w:lineRule="auto"/>
     </w:pPr>
     <w:rPr>
       <w:sz w:val="18"/>
@@ -12576,7 +12936,7 @@
     <w:name w:val="CV Pub"/>
     <w:basedOn w:val="Normal"/>
     <w:pPr>
-      <w:spacing w:after="40" w:line="274" w:lineRule="auto"/>
+      <w:spacing w:after="40" w:line="269" w:lineRule="auto"/>
     </w:pPr>
     <w:rPr>
       <w:sz w:val="18"/>
@@ -12586,7 +12946,7 @@
     <w:name w:val="CV Footer"/>
     <w:basedOn w:val="Normal"/>
     <w:pPr>
-      <w:spacing w:line="274" w:lineRule="auto"/>
+      <w:spacing w:line="269" w:lineRule="auto"/>
     </w:pPr>
     <w:rPr>
       <w:color w:val="42525E"/>

</xml_diff>